<commit_message>
docs: add all authentic images, charts, and captions into Word report (.docx)
</commit_message>
<xml_diff>
--- a/bài báo cáo về trường thpt chv (1).docx
+++ b/bài báo cáo về trường thpt chv (1).docx
@@ -2,6 +2,46 @@
 <file path=word/document.xml><?xml version="1.0" encoding="utf-8"?>
 <w:document xmlns:mc="http://schemas.openxmlformats.org/markup-compatibility/2006" xmlns:o="urn:schemas-microsoft-com:office:office" xmlns:r="http://schemas.openxmlformats.org/officeDocument/2006/relationships" xmlns:m="http://schemas.openxmlformats.org/officeDocument/2006/math" xmlns:v="urn:schemas-microsoft-com:vml" xmlns:wp="http://schemas.openxmlformats.org/drawingml/2006/wordprocessingDrawing" xmlns:w10="urn:schemas-microsoft-com:office:word" xmlns:w="http://schemas.openxmlformats.org/wordprocessingml/2006/main" xmlns:wne="http://schemas.microsoft.com/office/word/2006/wordml" xmlns:sl="http://schemas.openxmlformats.org/schemaLibrary/2006/main" xmlns:a="http://schemas.openxmlformats.org/drawingml/2006/main" xmlns:pic="http://schemas.openxmlformats.org/drawingml/2006/picture" xmlns:c="http://schemas.openxmlformats.org/drawingml/2006/chart" xmlns:lc="http://schemas.openxmlformats.org/drawingml/2006/lockedCanvas" xmlns:dgm="http://schemas.openxmlformats.org/drawingml/2006/diagram" xmlns:wps="http://schemas.microsoft.com/office/word/2010/wordprocessingShape" xmlns:wpg="http://schemas.microsoft.com/office/word/2010/wordprocessingGroup" xmlns:w14="http://schemas.microsoft.com/office/word/2010/wordml" xmlns:w15="http://schemas.microsoft.com/office/word/2012/wordml" xmlns:w16="http://schemas.microsoft.com/office/word/2018/wordml" xmlns:w16cex="http://schemas.microsoft.com/office/word/2018/wordml/cex" xmlns:w16cid="http://schemas.microsoft.com/office/word/2016/wordml/cid" xmlns="http://schemas.microsoft.com/office/tasks/2019/documenttasks" xmlns:cr="http://schemas.microsoft.com/office/comments/2020/reactions">
   <w:body>
+    <w:p>
+      <w:pPr>
+        <w:spacing w:before="280" w:after="120"/>
+        <w:jc w:val="center"/>
+      </w:pPr>
+      <w:r>
+        <w:drawing>
+          <wp:inline>
+            <wp:extent cx="1234440" cy="1234440"/>
+            <wp:docPr id="4" name="Picture 4"/>
+            <wp:cNvGraphicFramePr>
+              <a:graphicFrameLocks noChangeAspect="1"/>
+            </wp:cNvGraphicFramePr>
+            <a:graphic>
+              <a:graphicData uri="http://schemas.openxmlformats.org/drawingml/2006/picture">
+                <pic:pic>
+                  <pic:nvPicPr>
+                    <pic:cNvPr id="0" name="logo.png"/>
+                    <pic:cNvPicPr/>
+                  </pic:nvPicPr>
+                  <pic:blipFill>
+                    <a:blip r:embed="rId11"/>
+                    <a:stretch>
+                      <a:fillRect/>
+                    </a:stretch>
+                  </pic:blipFill>
+                  <pic:spPr>
+                    <a:xfrm>
+                      <a:off x="0" y="0"/>
+                      <a:ext cx="1234440" cy="1234440"/>
+                    </a:xfrm>
+                    <a:prstGeom prst="rect"/>
+                  </pic:spPr>
+                </pic:pic>
+              </a:graphicData>
+            </a:graphic>
+          </wp:inline>
+        </w:drawing>
+      </w:r>
+    </w:p>
     <w:p>
       <w:pPr>
         <w:spacing w:after="40" w:before="0" w:lineRule="auto"/>
@@ -331,6 +371,61 @@
     </w:p>
     <w:p>
       <w:pPr>
+        <w:spacing w:before="160" w:after="60"/>
+        <w:jc w:val="center"/>
+      </w:pPr>
+      <w:r>
+        <w:drawing>
+          <wp:inline>
+            <wp:extent cx="5303520" cy="3537448"/>
+            <wp:docPr id="5" name="Picture 5"/>
+            <wp:cNvGraphicFramePr>
+              <a:graphicFrameLocks noChangeAspect="1"/>
+            </wp:cNvGraphicFramePr>
+            <a:graphic>
+              <a:graphicData uri="http://schemas.openxmlformats.org/drawingml/2006/picture">
+                <pic:pic>
+                  <pic:nvPicPr>
+                    <pic:cNvPr id="0" name="image.png"/>
+                    <pic:cNvPicPr/>
+                  </pic:nvPicPr>
+                  <pic:blipFill>
+                    <a:blip r:embed="rId7"/>
+                    <a:stretch>
+                      <a:fillRect/>
+                    </a:stretch>
+                  </pic:blipFill>
+                  <pic:spPr>
+                    <a:xfrm>
+                      <a:off x="0" y="0"/>
+                      <a:ext cx="5303520" cy="3537448"/>
+                    </a:xfrm>
+                    <a:prstGeom prst="rect"/>
+                  </pic:spPr>
+                </pic:pic>
+              </a:graphicData>
+            </a:graphic>
+          </wp:inline>
+        </w:drawing>
+      </w:r>
+    </w:p>
+    <w:p>
+      <w:pPr>
+        <w:spacing w:before="0" w:after="240"/>
+        <w:jc w:val="center"/>
+      </w:pPr>
+      <w:r>
+        <w:rPr>
+          <w:rFonts w:ascii="Times New Roman" w:hAnsi="Times New Roman"/>
+          <w:i/>
+          <w:color w:val="505F73"/>
+          <w:sz w:val="19"/>
+        </w:rPr>
+        <w:t>Hình 1: Toàn cảnh Cổng trường THPT Chuyên Hùng Vương trong dịp Lễ hội Giỗ tổ Hùng Vương.</w:t>
+      </w:r>
+    </w:p>
+    <w:p>
+      <w:pPr>
         <w:rPr/>
       </w:pPr>
       <w:r>
@@ -1248,26 +1343,27 @@
     </w:tbl>
     <w:p>
       <w:pPr>
-        <w:spacing w:after="240" w:lineRule="auto"/>
+        <w:spacing w:after="60" w:lineRule="auto" w:before="160"/>
+        <w:jc w:val="center"/>
         <w:rPr/>
       </w:pPr>
       <w:r>
-        <w:rPr/>
         <w:drawing>
-          <wp:inline distB="114300" distT="114300" distL="114300" distR="114300">
-            <wp:extent cx="5357813" cy="3565841"/>
-            <wp:effectExtent b="0" l="0" r="0" t="0"/>
-            <wp:docPr id="1" name="image3.png"/>
+          <wp:inline>
+            <wp:extent cx="5486400" cy="2414205"/>
+            <wp:docPr id="6" name="Picture 6"/>
+            <wp:cNvGraphicFramePr>
+              <a:graphicFrameLocks noChangeAspect="1"/>
+            </wp:cNvGraphicFramePr>
             <a:graphic>
               <a:graphicData uri="http://schemas.openxmlformats.org/drawingml/2006/picture">
                 <pic:pic>
                   <pic:nvPicPr>
-                    <pic:cNvPr id="0" name="image3.png"/>
-                    <pic:cNvPicPr preferRelativeResize="0"/>
+                    <pic:cNvPr id="0" name="chart-timeline-30nam.png"/>
+                    <pic:cNvPicPr/>
                   </pic:nvPicPr>
                   <pic:blipFill>
-                    <a:blip r:embed="rId7"/>
-                    <a:srcRect b="0" l="0" r="0" t="0"/>
+                    <a:blip r:embed="rId12"/>
                     <a:stretch>
                       <a:fillRect/>
                     </a:stretch>
@@ -1275,10 +1371,9 @@
                   <pic:spPr>
                     <a:xfrm>
                       <a:off x="0" y="0"/>
-                      <a:ext cx="5357813" cy="3565841"/>
+                      <a:ext cx="5486400" cy="2414205"/>
                     </a:xfrm>
                     <a:prstGeom prst="rect"/>
-                    <a:ln/>
                   </pic:spPr>
                 </pic:pic>
               </a:graphicData>
@@ -1286,10 +1381,20 @@
           </wp:inline>
         </w:drawing>
       </w:r>
+    </w:p>
+    <w:p>
+      <w:pPr>
+        <w:spacing w:before="0" w:after="240"/>
+        <w:jc w:val="center"/>
+      </w:pPr>
       <w:r>
         <w:rPr>
-          <w:rtl w:val="0"/>
+          <w:rFonts w:ascii="Times New Roman" w:hAnsi="Times New Roman"/>
+          <w:i/>
+          <w:color w:val="505F73"/>
+          <w:sz w:val="19"/>
         </w:rPr>
+        <w:t>Hình 2: Sơ đồ Niên biểu 30 năm hình thành, xây dựng và phát triển nhà trường (1995–2026).</w:t>
       </w:r>
     </w:p>
     <w:p>
@@ -1400,6 +1505,76 @@
     </w:p>
     <w:p>
       <w:pPr>
+        <w:spacing w:before="0" w:after="240"/>
+        <w:jc w:val="center"/>
+      </w:pPr>
+      <w:r>
+        <w:rPr>
+          <w:rFonts w:ascii="Times New Roman" w:hAnsi="Times New Roman"/>
+          <w:i/>
+          <w:color w:val="505F73"/>
+          <w:sz w:val="19"/>
+        </w:rPr>
+        <w:t>Hình 3: Phòng thực hành Tin học hiện đại phục vụ công tác dạy học và nghiên cứu khoa học.</w:t>
+      </w:r>
+    </w:p>
+    <w:p>
+      <w:pPr>
+        <w:spacing w:before="160" w:after="60"/>
+        <w:jc w:val="center"/>
+      </w:pPr>
+      <w:r>
+        <w:drawing>
+          <wp:inline>
+            <wp:extent cx="4572000" cy="2551814"/>
+            <wp:docPr id="7" name="Picture 7"/>
+            <wp:cNvGraphicFramePr>
+              <a:graphicFrameLocks noChangeAspect="1"/>
+            </wp:cNvGraphicFramePr>
+            <a:graphic>
+              <a:graphicData uri="http://schemas.openxmlformats.org/drawingml/2006/picture">
+                <pic:pic>
+                  <pic:nvPicPr>
+                    <pic:cNvPr id="0" name="stem-may-phun-khuan.jpg"/>
+                    <pic:cNvPicPr/>
+                  </pic:nvPicPr>
+                  <pic:blipFill>
+                    <a:blip r:embed="rId13"/>
+                    <a:stretch>
+                      <a:fillRect/>
+                    </a:stretch>
+                  </pic:blipFill>
+                  <pic:spPr>
+                    <a:xfrm>
+                      <a:off x="0" y="0"/>
+                      <a:ext cx="4572000" cy="2551814"/>
+                    </a:xfrm>
+                    <a:prstGeom prst="rect"/>
+                  </pic:spPr>
+                </pic:pic>
+              </a:graphicData>
+            </a:graphic>
+          </wp:inline>
+        </w:drawing>
+      </w:r>
+    </w:p>
+    <w:p>
+      <w:pPr>
+        <w:spacing w:before="0" w:after="240"/>
+        <w:jc w:val="center"/>
+      </w:pPr>
+      <w:r>
+        <w:rPr>
+          <w:rFonts w:ascii="Times New Roman" w:hAnsi="Times New Roman"/>
+          <w:i/>
+          <w:color w:val="505F73"/>
+          <w:sz w:val="19"/>
+        </w:rPr>
+        <w:t>Hình 4: Sản phẩm STEM tiêu biểu “Máy phun sát khuẩn tay tự động” do học sinh nhà trường sáng chế.</w:t>
+      </w:r>
+    </w:p>
+    <w:p>
+      <w:pPr>
         <w:pStyle w:val="Heading1"/>
         <w:rPr/>
       </w:pPr>
@@ -1456,6 +1631,61 @@
           <w:rtl w:val="0"/>
         </w:rPr>
         <w:t xml:space="preserve">Theo bài công bố Vinh danh ngày 01/07/2026 của Ban Truyền thông nhà trường, toàn trường có 264 học sinh tham dự kỳ thi tốt nghiệp (01 học sinh miễn thi do thuộc đội tuyển Olympic quốc tế). Nhà trường xuất sắc đạt 14 lượt điểm 10 tuyệt đối (Môn Toán: 09 điểm 10, Môn Lịch sử: 03 điểm 10, Môn Sinh học: 02 điểm 10). Điểm bình quân các môn chuyên đạt mức rất cao: Tin học 8,64; Lịch sử 8,57; Hóa học 8,11; Toán 8,10; Sinh học 7,71.</w:t>
+      </w:r>
+    </w:p>
+    <w:p>
+      <w:pPr>
+        <w:spacing w:before="160" w:after="60"/>
+        <w:jc w:val="center"/>
+      </w:pPr>
+      <w:r>
+        <w:drawing>
+          <wp:inline>
+            <wp:extent cx="5303520" cy="3151366"/>
+            <wp:docPr id="8" name="Picture 8"/>
+            <wp:cNvGraphicFramePr>
+              <a:graphicFrameLocks noChangeAspect="1"/>
+            </wp:cNvGraphicFramePr>
+            <a:graphic>
+              <a:graphicData uri="http://schemas.openxmlformats.org/drawingml/2006/picture">
+                <pic:pic>
+                  <pic:nvPicPr>
+                    <pic:cNvPr id="0" name="chart-diem-tb-2026.png"/>
+                    <pic:cNvPicPr/>
+                  </pic:nvPicPr>
+                  <pic:blipFill>
+                    <a:blip r:embed="rId14"/>
+                    <a:stretch>
+                      <a:fillRect/>
+                    </a:stretch>
+                  </pic:blipFill>
+                  <pic:spPr>
+                    <a:xfrm>
+                      <a:off x="0" y="0"/>
+                      <a:ext cx="5303520" cy="3151366"/>
+                    </a:xfrm>
+                    <a:prstGeom prst="rect"/>
+                  </pic:spPr>
+                </pic:pic>
+              </a:graphicData>
+            </a:graphic>
+          </wp:inline>
+        </w:drawing>
+      </w:r>
+    </w:p>
+    <w:p>
+      <w:pPr>
+        <w:spacing w:before="0" w:after="240"/>
+        <w:jc w:val="center"/>
+      </w:pPr>
+      <w:r>
+        <w:rPr>
+          <w:rFonts w:ascii="Times New Roman" w:hAnsi="Times New Roman"/>
+          <w:i/>
+          <w:color w:val="505F73"/>
+          <w:sz w:val="19"/>
+        </w:rPr>
+        <w:t>Hình 5: Biểu đồ Điểm bình quân thi Tốt nghiệp THPT năm 2026 của học sinh các khối chuyên.</w:t>
       </w:r>
     </w:p>
     <w:p>
@@ -5251,6 +5481,116 @@
     </w:p>
     <w:p>
       <w:pPr>
+        <w:spacing w:before="160" w:after="60"/>
+        <w:jc w:val="center"/>
+      </w:pPr>
+      <w:r>
+        <w:drawing>
+          <wp:inline>
+            <wp:extent cx="5486400" cy="3039761"/>
+            <wp:docPr id="9" name="Picture 9"/>
+            <wp:cNvGraphicFramePr>
+              <a:graphicFrameLocks noChangeAspect="1"/>
+            </wp:cNvGraphicFramePr>
+            <a:graphic>
+              <a:graphicData uri="http://schemas.openxmlformats.org/drawingml/2006/picture">
+                <pic:pic>
+                  <pic:nvPicPr>
+                    <pic:cNvPr id="0" name="chart-diem-chuan-2025.png"/>
+                    <pic:cNvPicPr/>
+                  </pic:nvPicPr>
+                  <pic:blipFill>
+                    <a:blip r:embed="rId15"/>
+                    <a:stretch>
+                      <a:fillRect/>
+                    </a:stretch>
+                  </pic:blipFill>
+                  <pic:spPr>
+                    <a:xfrm>
+                      <a:off x="0" y="0"/>
+                      <a:ext cx="5486400" cy="3039761"/>
+                    </a:xfrm>
+                    <a:prstGeom prst="rect"/>
+                  </pic:spPr>
+                </pic:pic>
+              </a:graphicData>
+            </a:graphic>
+          </wp:inline>
+        </w:drawing>
+      </w:r>
+    </w:p>
+    <w:p>
+      <w:pPr>
+        <w:spacing w:before="0" w:after="240"/>
+        <w:jc w:val="center"/>
+      </w:pPr>
+      <w:r>
+        <w:rPr>
+          <w:rFonts w:ascii="Times New Roman" w:hAnsi="Times New Roman"/>
+          <w:i/>
+          <w:color w:val="505F73"/>
+          <w:sz w:val="19"/>
+        </w:rPr>
+        <w:t>Hình 6: Biểu đồ So sánh biến động Điểm chuẩn tuyển sinh vào lớp 10 các môn chuyên (2024–2026).</w:t>
+      </w:r>
+    </w:p>
+    <w:p>
+      <w:pPr>
+        <w:spacing w:before="160" w:after="60"/>
+        <w:jc w:val="center"/>
+      </w:pPr>
+      <w:r>
+        <w:drawing>
+          <wp:inline>
+            <wp:extent cx="5486400" cy="2891481"/>
+            <wp:docPr id="10" name="Picture 10"/>
+            <wp:cNvGraphicFramePr>
+              <a:graphicFrameLocks noChangeAspect="1"/>
+            </wp:cNvGraphicFramePr>
+            <a:graphic>
+              <a:graphicData uri="http://schemas.openxmlformats.org/drawingml/2006/picture">
+                <pic:pic>
+                  <pic:nvPicPr>
+                    <pic:cNvPr id="0" name="chart-quy-mo-tuyen-sinh.png"/>
+                    <pic:cNvPicPr/>
+                  </pic:nvPicPr>
+                  <pic:blipFill>
+                    <a:blip r:embed="rId16"/>
+                    <a:stretch>
+                      <a:fillRect/>
+                    </a:stretch>
+                  </pic:blipFill>
+                  <pic:spPr>
+                    <a:xfrm>
+                      <a:off x="0" y="0"/>
+                      <a:ext cx="5486400" cy="2891481"/>
+                    </a:xfrm>
+                    <a:prstGeom prst="rect"/>
+                  </pic:spPr>
+                </pic:pic>
+              </a:graphicData>
+            </a:graphic>
+          </wp:inline>
+        </w:drawing>
+      </w:r>
+    </w:p>
+    <w:p>
+      <w:pPr>
+        <w:spacing w:before="0" w:after="240"/>
+        <w:jc w:val="center"/>
+      </w:pPr>
+      <w:r>
+        <w:rPr>
+          <w:rFonts w:ascii="Times New Roman" w:hAnsi="Times New Roman"/>
+          <w:i/>
+          <w:color w:val="505F73"/>
+          <w:sz w:val="19"/>
+        </w:rPr>
+        <w:t>Hình 7: Biểu đồ Cơ cấu chỉ tiêu phân bổ tuyển sinh lớp 10 năm học 2026–2027 theo từng môn chuyên.</w:t>
+      </w:r>
+    </w:p>
+    <w:p>
+      <w:pPr>
         <w:pStyle w:val="Heading1"/>
         <w:rPr/>
       </w:pPr>
@@ -5284,6 +5624,116 @@
         <w:t xml:space="preserve">• Cuộc thi 'Đại sứ Văn hóa đọc TP. Hồ Chí Minh' năm 2026 (16/08/2026).</w:t>
         <w:br w:type="textWrapping"/>
         <w:t xml:space="preserve">• Hoạt động ngoại khóa trải nghiệm Đà Lạt, Lễ kết nạp Đoàn viên mới và Chiến dịch Tiếp sức mùa thi.</w:t>
+      </w:r>
+    </w:p>
+    <w:p>
+      <w:pPr>
+        <w:spacing w:before="160" w:after="60"/>
+        <w:jc w:val="center"/>
+      </w:pPr>
+      <w:r>
+        <w:drawing>
+          <wp:inline>
+            <wp:extent cx="4754880" cy="2653887"/>
+            <wp:docPr id="11" name="Picture 11"/>
+            <wp:cNvGraphicFramePr>
+              <a:graphicFrameLocks noChangeAspect="1"/>
+            </wp:cNvGraphicFramePr>
+            <a:graphic>
+              <a:graphicData uri="http://schemas.openxmlformats.org/drawingml/2006/picture">
+                <pic:pic>
+                  <pic:nvPicPr>
+                    <pic:cNvPr id="0" name="asia-youth-leaders.jpg"/>
+                    <pic:cNvPicPr/>
+                  </pic:nvPicPr>
+                  <pic:blipFill>
+                    <a:blip r:embed="rId17"/>
+                    <a:stretch>
+                      <a:fillRect/>
+                    </a:stretch>
+                  </pic:blipFill>
+                  <pic:spPr>
+                    <a:xfrm>
+                      <a:off x="0" y="0"/>
+                      <a:ext cx="4754880" cy="2653887"/>
+                    </a:xfrm>
+                    <a:prstGeom prst="rect"/>
+                  </pic:spPr>
+                </pic:pic>
+              </a:graphicData>
+            </a:graphic>
+          </wp:inline>
+        </w:drawing>
+      </w:r>
+    </w:p>
+    <w:p>
+      <w:pPr>
+        <w:spacing w:before="0" w:after="240"/>
+        <w:jc w:val="center"/>
+      </w:pPr>
+      <w:r>
+        <w:rPr>
+          <w:rFonts w:ascii="Times New Roman" w:hAnsi="Times New Roman"/>
+          <w:i/>
+          <w:color w:val="505F73"/>
+          <w:sz w:val="19"/>
+        </w:rPr>
+        <w:t>Hình 8: Đoàn học sinh nhà trường tham gia chương trình hội nhập quốc tế “Asia Youth Leaders 2026” tại Nhật Bản.</w:t>
+      </w:r>
+    </w:p>
+    <w:p>
+      <w:pPr>
+        <w:spacing w:before="160" w:after="60"/>
+        <w:jc w:val="center"/>
+      </w:pPr>
+      <w:r>
+        <w:drawing>
+          <wp:inline>
+            <wp:extent cx="4572000" cy="2551814"/>
+            <wp:docPr id="12" name="Picture 12"/>
+            <wp:cNvGraphicFramePr>
+              <a:graphicFrameLocks noChangeAspect="1"/>
+            </wp:cNvGraphicFramePr>
+            <a:graphic>
+              <a:graphicData uri="http://schemas.openxmlformats.org/drawingml/2006/picture">
+                <pic:pic>
+                  <pic:nvPicPr>
+                    <pic:cNvPr id="0" name="dai-su-van-hoa-doc.jpg"/>
+                    <pic:cNvPicPr/>
+                  </pic:nvPicPr>
+                  <pic:blipFill>
+                    <a:blip r:embed="rId18"/>
+                    <a:stretch>
+                      <a:fillRect/>
+                    </a:stretch>
+                  </pic:blipFill>
+                  <pic:spPr>
+                    <a:xfrm>
+                      <a:off x="0" y="0"/>
+                      <a:ext cx="4572000" cy="2551814"/>
+                    </a:xfrm>
+                    <a:prstGeom prst="rect"/>
+                  </pic:spPr>
+                </pic:pic>
+              </a:graphicData>
+            </a:graphic>
+          </wp:inline>
+        </w:drawing>
+      </w:r>
+    </w:p>
+    <w:p>
+      <w:pPr>
+        <w:spacing w:before="0" w:after="240"/>
+        <w:jc w:val="center"/>
+      </w:pPr>
+      <w:r>
+        <w:rPr>
+          <w:rFonts w:ascii="Times New Roman" w:hAnsi="Times New Roman"/>
+          <w:i/>
+          <w:color w:val="505F73"/>
+          <w:sz w:val="19"/>
+        </w:rPr>
+        <w:t>Hình 9: Học sinh Trường THPT Chuyên Hùng Vương tham gia và đạt giải Cuộc thi “Đại sứ Văn hóa đọc”.</w:t>
       </w:r>
     </w:p>
     <w:p>

</xml_diff>